<commit_message>
Event Type Selection Implementation
</commit_message>
<xml_diff>
--- a/CampCon_Project_Abstract.docx
+++ b/CampCon_Project_Abstract.docx
@@ -29,7 +29,7 @@
           <w:color w:val="3182CE"/>
           <w:sz w:val="24"/>
         </w:rPr>
-        <w:t>Project Abstract &amp; System Architecture Specification</w:t>
+        <w:t>Full-Stack Architecture &amp; Project Specification</w:t>
       </w:r>
     </w:p>
     <w:p>
@@ -63,7 +63,7 @@
         <w:spacing w:line="276" w:lineRule="auto" w:after="120"/>
       </w:pPr>
       <w:r>
-        <w:t>Modern academic institutions host a wide array of curricular and extracurricular activities; however, decentralized communication and fragmented scheduling often lead to low student participation, administrative bottlenecks, and attendance reconciliation inefficiencies. To address these challenges, CampCon is developed as a comprehensive, role-driven web application designed to unify the end-to-end lifecycle of campus events within a centralized ecosystem.</w:t>
+        <w:t>Modern academic institutions host a wide array of curricular and extracurricular activities; however, decentralized communication and fragmented scheduling often lead to low student participation, administrative bottlenecks, and attendance reconciliation inefficiencies. To address these challenges, CampCon is developed as a comprehensive, role-driven full-stack web application designed to unify the end-to-end lifecycle of campus events within a centralized, secure ecosystem.</w:t>
       </w:r>
     </w:p>
     <w:p>
@@ -71,7 +71,10 @@
         <w:spacing w:line="276" w:lineRule="auto" w:after="200"/>
       </w:pPr>
       <w:r>
-        <w:t>The platform incorporates a robust Role-Based Access Control (RBAC) framework catering to Students, Organizers, and Institutional Administrators. Students benefit from intuitive event exploration through categorized listings, full-text search, multi-criteria filtering, personalized interest-based recommendations, instant registration, and digital QR-code pass generation. Organizers are equipped with a structured event creation pipeline, registration approval workflows, volunteer delegation tools, contactless QR attendance scanning, and visual capacity analytics powered by Chart.js. Administrators maintain system-wide governance, oversee user privileges, and analyze cross-departmental engagement metrics. Built on a modern React 19 architecture leveraging React Context, Bootstrap 5, and secure JWT-authenticated RESTful services, CampCon significantly reduces administrative overhead, eliminates paper waste, and establishes an active, interconnected campus community.</w:t>
+        <w:t>The system incorporates a robust multi-tier Role-Based Access Control (RBAC) framework serving Students, Organizers, and Institutional Administrators. Students benefit from structured event exploration through categorized listings, keyword search, multi-criteria filtering, interest-based recommendations, and digital QR-code pass generation. Organizers are equipped with an event creation pipeline, registration approval workflows, volunteer delegation tools, contactless QR attendance scanning, and real-time capacity analytics powered by Chart.js. Institutional Administrators oversee user privileges, role escalations, and cross-departmental engagement trends.</w:t>
+        <w:br/>
+        <w:br/>
+        <w:t>On the technical front, CampCon implements a modular client-server architecture. The frontend is built with React 19, Bootstrap 5, and React Context API, integrated with a high-performance Node.js / Express 5 RESTful backend. Data persistence is managed via MySQL through Prisma ORM, safeguarded by JSON Web Tokens (JWT), bcrypt password hashing, Helmet security headers, and rate-limiting middleware. CampCon eliminates paper waste, reduces manual administrative friction, and establishes an active, interconnected campus community.</w:t>
       </w:r>
     </w:p>
     <w:p>
@@ -86,7 +89,7 @@
         <w:t xml:space="preserve">Keywords: </w:t>
       </w:r>
       <w:r>
-        <w:t>Campus Event Management, Role-Based Access Control (RBAC), React 19, Digital Ticketing, QR Attendance Verification, Data Visualization, RESTful Architecture.</w:t>
+        <w:t>Campus Event Management, Full-Stack Development, React 19, Node.js, Express, MySQL, Prisma ORM, Role-Based Access Control (RBAC), QR Attendance, JWT Authentication.</w:t>
       </w:r>
     </w:p>
     <w:p>
@@ -100,18 +103,7 @@
           <w:color w:val="1A365D"/>
           <w:sz w:val="32"/>
         </w:rPr>
-        <w:t>2. Resume / Portfolio Bullet Points (Matching Style)</w:t>
-      </w:r>
-    </w:p>
-    <w:p>
-      <w:pPr>
-        <w:spacing w:after="120"/>
-      </w:pPr>
-      <w:r>
-        <w:rPr>
-          <w:i/>
-        </w:rPr>
-        <w:t>Tailored to match the exact action-oriented, high-impact phrasing style of your previous project:</w:t>
+        <w:t>2. Resume / Portfolio Bullet Points</w:t>
       </w:r>
     </w:p>
     <w:p>
@@ -123,7 +115,7 @@
           <w:b/>
           <w:color w:val="3182CE"/>
         </w:rPr>
-        <w:t>Option A: Direct Match (Recommended 2-Bullet Format)</w:t>
+        <w:t>Recommended Full-Stack 2-Bullet Format (Matching Style)</w:t>
       </w:r>
     </w:p>
     <w:p>
@@ -132,7 +124,7 @@
         <w:ind w:left="360"/>
       </w:pPr>
       <w:r>
-        <w:t>• Developed a React-based campus event intelligence web application with categorized listings, keyword search, and structured filtering for efficient activity exploration.</w:t>
+        <w:t>• Developed a full-stack campus event intelligence web application using React 19, Node.js, and MySQL with categorized listings, keyword search, and structured filtering for seamless activity exploration.</w:t>
       </w:r>
     </w:p>
     <w:p>
@@ -141,37 +133,7 @@
         <w:ind w:left="360"/>
       </w:pPr>
       <w:r>
-        <w:t>• Implemented a modular component architecture with role-based access control (RBAC), digital QR ticketing, and interactive analytics to streamline event participation and administrative workflows.</w:t>
-      </w:r>
-    </w:p>
-    <w:p>
-      <w:pPr>
-        <w:spacing w:before="160" w:after="80"/>
-      </w:pPr>
-      <w:r>
-        <w:rPr>
-          <w:b/>
-          <w:color w:val="3182CE"/>
-        </w:rPr>
-        <w:t>Option B: Full-Stack &amp; Feature-Focused Format</w:t>
-      </w:r>
-    </w:p>
-    <w:p>
-      <w:pPr>
-        <w:spacing w:after="80"/>
-        <w:ind w:left="360"/>
-      </w:pPr>
-      <w:r>
-        <w:t>• Engineered an interactive event management platform featuring real-time search, dynamic category filtering, and personalized recommendations to accelerate campus event discovery.</w:t>
-      </w:r>
-    </w:p>
-    <w:p>
-      <w:pPr>
-        <w:spacing w:after="80"/>
-        <w:ind w:left="360"/>
-      </w:pPr>
-      <w:r>
-        <w:t>• Built secure REST API integrations with JWT authentication, automated QR-code attendance verification, and Chart.js dashboards to monitor registration analytics and streamline volunteer management.</w:t>
+        <w:t>• Implemented a modular RESTful architecture with Prisma ORM, JWT-based role authentication (RBAC), contactless QR-code ticketing, and Chart.js analytics to automate event approvals and attendance verification.</w:t>
       </w:r>
     </w:p>
     <w:p>
@@ -185,85 +147,7 @@
           <w:color w:val="1A365D"/>
           <w:sz w:val="32"/>
         </w:rPr>
-        <w:t>3. Core Modules &amp; Functionality</w:t>
-      </w:r>
-    </w:p>
-    <w:p>
-      <w:pPr>
-        <w:spacing w:after="80"/>
-        <w:ind w:left="288"/>
-      </w:pPr>
-      <w:r>
-        <w:rPr>
-          <w:b/>
-          <w:color w:val="1A365D"/>
-        </w:rPr>
-        <w:t xml:space="preserve">• Student Portal: </w:t>
-      </w:r>
-      <w:r>
-        <w:t>Search and filter events by department/category, bookmark upcoming events, reserve seats, generate digital QR admission passes, track event attendance, and access certificates.</w:t>
-      </w:r>
-    </w:p>
-    <w:p>
-      <w:pPr>
-        <w:spacing w:after="80"/>
-        <w:ind w:left="288"/>
-      </w:pPr>
-      <w:r>
-        <w:rPr>
-          <w:b/>
-          <w:color w:val="1A365D"/>
-        </w:rPr>
-        <w:t xml:space="preserve">• Organizer Suite: </w:t>
-      </w:r>
-      <w:r>
-        <w:t>Event creation with quota controls and deadline tracking, registration approval/rejection pipeline, volunteer assignment, contactless QR verification, and real-time revenue/capacity charts.</w:t>
-      </w:r>
-    </w:p>
-    <w:p>
-      <w:pPr>
-        <w:spacing w:after="80"/>
-        <w:ind w:left="288"/>
-      </w:pPr>
-      <w:r>
-        <w:rPr>
-          <w:b/>
-          <w:color w:val="1A365D"/>
-        </w:rPr>
-        <w:t xml:space="preserve">• Administrative Console: </w:t>
-      </w:r>
-      <w:r>
-        <w:t>System-level user management and role escalation (Student, Organizer, Admin), platform-wide event monitoring, and departmental engagement distribution visual analytics.</w:t>
-      </w:r>
-    </w:p>
-    <w:p>
-      <w:pPr>
-        <w:spacing w:after="80"/>
-        <w:ind w:left="288"/>
-      </w:pPr>
-      <w:r>
-        <w:rPr>
-          <w:b/>
-          <w:color w:val="1A365D"/>
-        </w:rPr>
-        <w:t xml:space="preserve">• Data &amp; Security Architecture: </w:t>
-      </w:r>
-      <w:r>
-        <w:t>Centralized state management with React Context API, token-based JWT security layer with automated session invalidation interceptors, and modular responsive UI design.</w:t>
-      </w:r>
-    </w:p>
-    <w:p>
-      <w:pPr>
-        <w:pStyle w:val="Heading1"/>
-        <w:spacing w:before="240" w:after="120"/>
-      </w:pPr>
-      <w:r>
-        <w:rPr>
-          <w:b/>
-          <w:color w:val="1A365D"/>
-          <w:sz w:val="32"/>
-        </w:rPr>
-        <w:t>4. Technical Specifications</w:t>
+        <w:t>3. Full-Stack Technical Specifications</w:t>
       </w:r>
     </w:p>
     <w:tbl>
@@ -297,7 +181,7 @@
                 <w:b/>
                 <w:color w:val="FFFFFF"/>
               </w:rPr>
-              <w:t>Component</w:t>
+              <w:t>Layer</w:t>
             </w:r>
           </w:p>
         </w:tc>
@@ -316,7 +200,7 @@
                 <w:b/>
                 <w:color w:val="FFFFFF"/>
               </w:rPr>
-              <w:t>Technology / Tool</w:t>
+              <w:t>Technology / Framework</w:t>
             </w:r>
           </w:p>
         </w:tc>
@@ -335,7 +219,7 @@
                 <w:b/>
                 <w:color w:val="FFFFFF"/>
               </w:rPr>
-              <w:t>Purpose / Role</w:t>
+              <w:t>Key Role / Implementation</w:t>
             </w:r>
           </w:p>
         </w:tc>
@@ -358,7 +242,7 @@
               <w:rPr>
                 <w:sz w:val="19"/>
               </w:rPr>
-              <w:t>Frontend Framework</w:t>
+              <w:t>Frontend Client</w:t>
             </w:r>
           </w:p>
         </w:tc>
@@ -376,7 +260,7 @@
               <w:rPr>
                 <w:sz w:val="19"/>
               </w:rPr>
-              <w:t>React 19, Vite</w:t>
+              <w:t>React 19, Vite 8, JavaScript (ES6+)</w:t>
             </w:r>
           </w:p>
         </w:tc>
@@ -394,7 +278,7 @@
               <w:rPr>
                 <w:sz w:val="19"/>
               </w:rPr>
-              <w:t>High-performance Single Page Application (SPA)</w:t>
+              <w:t>Single Page Application (SPA), custom hooks, responsive component architecture</w:t>
             </w:r>
           </w:p>
         </w:tc>
@@ -417,7 +301,7 @@
               <w:rPr>
                 <w:sz w:val="19"/>
               </w:rPr>
-              <w:t>Styling &amp; UI</w:t>
+              <w:t>UI &amp; Styling</w:t>
             </w:r>
           </w:p>
         </w:tc>
@@ -453,7 +337,7 @@
               <w:rPr>
                 <w:sz w:val="19"/>
               </w:rPr>
-              <w:t>Responsive design, modern dark/slate themed components</w:t>
+              <w:t>Clean responsive dark/slate UI, modal dialogs, responsive cards</w:t>
             </w:r>
           </w:p>
         </w:tc>
@@ -476,7 +360,7 @@
               <w:rPr>
                 <w:sz w:val="19"/>
               </w:rPr>
-              <w:t>Routing &amp; Navigation</w:t>
+              <w:t>Client State &amp; Routes</w:t>
             </w:r>
           </w:p>
         </w:tc>
@@ -494,7 +378,7 @@
               <w:rPr>
                 <w:sz w:val="19"/>
               </w:rPr>
-              <w:t>React Router DOM v7</w:t>
+              <w:t>React Context API, React Router DOM v7</w:t>
             </w:r>
           </w:p>
         </w:tc>
@@ -512,7 +396,7 @@
               <w:rPr>
                 <w:sz w:val="19"/>
               </w:rPr>
-              <w:t>Dynamic client-side routing with protected routes</w:t>
+              <w:t>Centralized user/event state, session hydration, protected routes</w:t>
             </w:r>
           </w:p>
         </w:tc>
@@ -535,7 +419,7 @@
               <w:rPr>
                 <w:sz w:val="19"/>
               </w:rPr>
-              <w:t>State Management</w:t>
+              <w:t>Backend Server</w:t>
             </w:r>
           </w:p>
         </w:tc>
@@ -553,7 +437,7 @@
               <w:rPr>
                 <w:sz w:val="19"/>
               </w:rPr>
-              <w:t>React Context API &amp; LocalStorage</w:t>
+              <w:t>Node.js, Express.js 5</w:t>
             </w:r>
           </w:p>
         </w:tc>
@@ -571,7 +455,7 @@
               <w:rPr>
                 <w:sz w:val="19"/>
               </w:rPr>
-              <w:t>Global user state, hydration, toasts, and real-time sync</w:t>
+              <w:t>Modular REST API architecture, routing pipelines, controller-service patterns</w:t>
             </w:r>
           </w:p>
         </w:tc>
@@ -594,7 +478,7 @@
               <w:rPr>
                 <w:sz w:val="19"/>
               </w:rPr>
-              <w:t>Analytics &amp; Visuals</w:t>
+              <w:t>Database &amp; ORM</w:t>
             </w:r>
           </w:p>
         </w:tc>
@@ -612,7 +496,7 @@
               <w:rPr>
                 <w:sz w:val="19"/>
               </w:rPr>
-              <w:t>Chart.js, react-chartjs-2</w:t>
+              <w:t>MySQL, Prisma ORM 6.4</w:t>
             </w:r>
           </w:p>
         </w:tc>
@@ -630,7 +514,7 @@
               <w:rPr>
                 <w:sz w:val="19"/>
               </w:rPr>
-              <w:t>Interactive bar charts and doughnut charts for capacity/metrics</w:t>
+              <w:t>Relational data modeling, schema migrations, type-safe queries, relation joins</w:t>
             </w:r>
           </w:p>
         </w:tc>
@@ -653,7 +537,7 @@
               <w:rPr>
                 <w:sz w:val="19"/>
               </w:rPr>
-              <w:t>API &amp; Auth Integration</w:t>
+              <w:t>Authentication &amp; Security</w:t>
             </w:r>
           </w:p>
         </w:tc>
@@ -671,7 +555,7 @@
               <w:rPr>
                 <w:sz w:val="19"/>
               </w:rPr>
-              <w:t>Axios (Interceptors), JWT</w:t>
+              <w:t>JWT, bcryptjs, Helmet, express-rate-limit</w:t>
             </w:r>
           </w:p>
         </w:tc>
@@ -689,7 +573,7 @@
               <w:rPr>
                 <w:sz w:val="19"/>
               </w:rPr>
-              <w:t>Secure HTTP communication and token expiration handling</w:t>
+              <w:t>Token-based RBAC (Student/Organizer/Admin), password hashing, DDoS mitigation</w:t>
             </w:r>
           </w:p>
         </w:tc>
@@ -712,7 +596,7 @@
               <w:rPr>
                 <w:sz w:val="19"/>
               </w:rPr>
-              <w:t>Testing Suite</w:t>
+              <w:t>Analytics &amp; Ticketing</w:t>
             </w:r>
           </w:p>
         </w:tc>
@@ -730,7 +614,7 @@
               <w:rPr>
                 <w:sz w:val="19"/>
               </w:rPr>
-              <w:t>Vitest, React Testing Library</w:t>
+              <w:t>Chart.js, HTML5 Canvas QR Generator</w:t>
             </w:r>
           </w:p>
         </w:tc>
@@ -748,7 +632,66 @@
               <w:rPr>
                 <w:sz w:val="19"/>
               </w:rPr>
-              <w:t>Component unit testing and verification</w:t>
+              <w:t>Interactive capacity charts, digital QR ticketing, automated attendance check-in</w:t>
+            </w:r>
+          </w:p>
+        </w:tc>
+      </w:tr>
+      <w:tr>
+        <w:trPr>
+          <w:cantSplit/>
+        </w:trPr>
+        <w:tc>
+          <w:tcPr>
+            <w:tcW w:type="dxa" w:w="2592"/>
+            <w:vAlign w:val="center"/>
+            <w:shd w:fill="FFFFFF"/>
+          </w:tcPr>
+          <w:p>
+            <w:pPr>
+              <w:spacing w:before="80" w:after="80"/>
+            </w:pPr>
+            <w:r>
+              <w:rPr>
+                <w:sz w:val="19"/>
+              </w:rPr>
+              <w:t>Testing Frameworks</w:t>
+            </w:r>
+          </w:p>
+        </w:tc>
+        <w:tc>
+          <w:tcPr>
+            <w:tcW w:type="dxa" w:w="3168"/>
+            <w:vAlign w:val="center"/>
+            <w:shd w:fill="FFFFFF"/>
+          </w:tcPr>
+          <w:p>
+            <w:pPr>
+              <w:spacing w:before="80" w:after="80"/>
+            </w:pPr>
+            <w:r>
+              <w:rPr>
+                <w:sz w:val="19"/>
+              </w:rPr>
+              <w:t>Vitest, React Testing Library, Supertest</w:t>
+            </w:r>
+          </w:p>
+        </w:tc>
+        <w:tc>
+          <w:tcPr>
+            <w:tcW w:type="dxa" w:w="3600"/>
+            <w:vAlign w:val="center"/>
+            <w:shd w:fill="FFFFFF"/>
+          </w:tcPr>
+          <w:p>
+            <w:pPr>
+              <w:spacing w:before="80" w:after="80"/>
+            </w:pPr>
+            <w:r>
+              <w:rPr>
+                <w:sz w:val="19"/>
+              </w:rPr>
+              <w:t>Client unit testing, API endpoint integration testing, mock suites</w:t>
             </w:r>
           </w:p>
         </w:tc>

</xml_diff>